<commit_message>
feat: release world architect v1.3.0
Add creation anchors, institutional pressure and regional contrast guidance.
Improve natural Chinese reader structure without importing work-specific canon.
Support true four-level headings and contents with sparse-ending warnings.
Preserve legacy templates and add 18 regression tests.
</commit_message>
<xml_diff>
--- a/skills/story-world-architect/assets/reader-template.docx
+++ b/skills/story-world-architect/assets/reader-template.docx
@@ -605,33 +605,29 @@
       <w:sz w:val="28"/>
     </w:rPr>
   </w:style>
-  <w:style w:type="paragraph" w:styleId="6">
+  <w:style w:type="paragraph" w:customStyle="1" w:styleId="6">
     <w:name w:val="heading 4"/>
     <w:basedOn w:val="1"/>
     <w:next w:val="1"/>
     <w:link w:val="150"/>
-    <w:semiHidden/>
-    <w:unhideWhenUsed/>
     <w:qFormat/>
-    <w:uiPriority w:val="9"/>
     <w:pPr>
       <w:keepNext/>
       <w:keepLines/>
-      <w:spacing w:before="200" w:after="0"/>
+      <w:pageBreakBefore w:val="0"/>
+      <w:widowControl/>
+      <w:spacing w:before="200" w:after="120" w:line="276" w:lineRule="auto"/>
+      <w:ind w:left="240" w:firstLine="0"/>
       <w:outlineLvl w:val="3"/>
     </w:pPr>
     <w:rPr>
-      <w:rFonts w:asciiTheme="majorHAnsi" w:hAnsiTheme="majorHAnsi" w:eastAsiaTheme="majorEastAsia" w:cstheme="majorBidi"/>
+      <w:rFonts w:ascii="微软雅黑" w:hAnsi="微软雅黑" w:eastAsia="微软雅黑" w:cs="微软雅黑"/>
       <w:b/>
       <w:bCs/>
-      <w:i/>
-      <w:iCs/>
-      <w:color w:val="4F81BD" w:themeColor="accent1"/>
-      <w14:textFill>
-        <w14:solidFill>
-          <w14:schemeClr w14:val="accent1"/>
-        </w14:solidFill>
-      </w14:textFill>
+      <w:i w:val="0"/>
+      <w:color w:val="C55A11"/>
+      <w:sz w:val="25"/>
+      <w:szCs w:val="25"/>
     </w:rPr>
   </w:style>
   <w:style w:type="paragraph" w:styleId="7">
@@ -13081,6 +13077,26 @@
       <w:color w:val="000000"/>
       <w:sz w:val="18"/>
       <w:szCs w:val="22"/>
+      <w:lang w:val="en-US" w:eastAsia="en-US" w:bidi="ar-SA"/>
+    </w:rPr>
+  </w:style>
+  <w:style w:type="paragraph" w:customStyle="1" w:styleId="Contents4">
+    <w:name w:val="Contents 4"/>
+    <w:next w:val="169"/>
+    <w:pPr>
+      <w:keepLines/>
+      <w:tabs>
+        <w:tab w:val="right" w:leader="dot" w:pos="9000"/>
+      </w:tabs>
+      <w:spacing w:before="0" w:after="20" w:line="259" w:lineRule="auto"/>
+      <w:ind w:left="780" w:right="40" w:firstLine="0"/>
+    </w:pPr>
+    <w:rPr>
+      <w:rFonts w:ascii="微软雅黑" w:hAnsi="微软雅黑" w:eastAsia="微软雅黑" w:cs="微软雅黑"/>
+      <w:b w:val="0"/>
+      <w:color w:val="000000"/>
+      <w:sz w:val="20"/>
+      <w:szCs w:val="20"/>
       <w:lang w:val="en-US" w:eastAsia="en-US" w:bidi="ar-SA"/>
     </w:rPr>
   </w:style>

</xml_diff>